<commit_message>
se realiza entrega de laboratorio numero 4
</commit_message>
<xml_diff>
--- a/MYSD-2026-02-L04.docx
+++ b/MYSD-2026-02-L04.docx
@@ -733,7 +733,7 @@
                     </pic:cNvPicPr>
                   </pic:nvPicPr>
                   <pic:blipFill>
-                    <a:blip r:embed="rId4">
+                    <a:blip r:embed="rId5">
                       <a:extLst>
                         <a:ext uri="{28A0092B-C50C-407E-A947-70E740481C1C}">
                           <a14:useLocalDpi xmlns:a14="http://schemas.microsoft.com/office/drawing/2010/main" val="0"/>
@@ -961,6 +961,66 @@
           <w:szCs w:val="19"/>
         </w:rPr>
       </w:pPr>
+      <w:r>
+        <w:rPr>
+          <w:color w:val="000000"/>
+          <w:sz w:val="19"/>
+          <w:szCs w:val="19"/>
+        </w:rPr>
+        <w:drawing>
+          <wp:inline distT="0" distB="0" distL="0" distR="0" wp14:anchorId="460F9DC9" wp14:editId="60250946">
+            <wp:extent cx="4102100" cy="2730500"/>
+            <wp:effectExtent l="0" t="0" r="0" b="0"/>
+            <wp:docPr id="632638719" name="Imagen 1"/>
+            <wp:cNvGraphicFramePr>
+              <a:graphicFrameLocks xmlns:a="http://schemas.openxmlformats.org/drawingml/2006/main" noChangeAspect="1"/>
+            </wp:cNvGraphicFramePr>
+            <a:graphic xmlns:a="http://schemas.openxmlformats.org/drawingml/2006/main">
+              <a:graphicData uri="http://schemas.openxmlformats.org/drawingml/2006/picture">
+                <pic:pic xmlns:pic="http://schemas.openxmlformats.org/drawingml/2006/picture">
+                  <pic:nvPicPr>
+                    <pic:cNvPr id="632638719" name=""/>
+                    <pic:cNvPicPr/>
+                  </pic:nvPicPr>
+                  <pic:blipFill>
+                    <a:blip r:embed="rId6"/>
+                    <a:stretch>
+                      <a:fillRect/>
+                    </a:stretch>
+                  </pic:blipFill>
+                  <pic:spPr>
+                    <a:xfrm>
+                      <a:off x="0" y="0"/>
+                      <a:ext cx="4102100" cy="2730500"/>
+                    </a:xfrm>
+                    <a:prstGeom prst="rect">
+                      <a:avLst/>
+                    </a:prstGeom>
+                  </pic:spPr>
+                </pic:pic>
+              </a:graphicData>
+            </a:graphic>
+          </wp:inline>
+        </w:drawing>
+      </w:r>
+    </w:p>
+    <w:p>
+      <w:pPr>
+        <w:widowControl w:val="0"/>
+        <w:pBdr>
+          <w:top w:val="nil"/>
+          <w:left w:val="nil"/>
+          <w:bottom w:val="nil"/>
+          <w:right w:val="nil"/>
+          <w:between w:val="nil"/>
+        </w:pBdr>
+        <w:spacing w:before="59" w:line="199" w:lineRule="auto"/>
+        <w:rPr>
+          <w:color w:val="000000"/>
+          <w:sz w:val="19"/>
+          <w:szCs w:val="19"/>
+        </w:rPr>
+      </w:pPr>
     </w:p>
     <w:p>
       <w:pPr>
@@ -1956,6 +2016,7 @@
           <w:sz w:val="15"/>
           <w:szCs w:val="15"/>
         </w:rPr>
+        <w:lastRenderedPageBreak/>
         <w:t xml:space="preserve">Acciones </w:t>
       </w:r>
     </w:p>
@@ -2379,13 +2440,17 @@
           <w:sz w:val="28"/>
           <w:szCs w:val="28"/>
         </w:rPr>
-        <w:lastRenderedPageBreak/>
         <w:t>RETROSPECTIVA</w:t>
       </w:r>
     </w:p>
     <w:p>
       <w:pPr>
-        <w:widowControl w:val="0"/>
+        <w:pStyle w:val="Prrafodelista"/>
+        <w:widowControl w:val="0"/>
+        <w:numPr>
+          <w:ilvl w:val="0"/>
+          <w:numId w:val="1"/>
+        </w:numPr>
         <w:pBdr>
           <w:top w:val="nil"/>
           <w:left w:val="nil"/>
@@ -2394,25 +2459,164 @@
           <w:between w:val="nil"/>
         </w:pBdr>
         <w:spacing w:before="64" w:line="211" w:lineRule="auto"/>
-        <w:ind w:left="257" w:right="1183" w:firstLine="14"/>
-        <w:rPr>
-          <w:color w:val="000000"/>
-          <w:sz w:val="21"/>
-          <w:szCs w:val="21"/>
-        </w:rPr>
-      </w:pPr>
-      <w:r>
-        <w:rPr>
-          <w:color w:val="000000"/>
-          <w:sz w:val="21"/>
-          <w:szCs w:val="21"/>
-        </w:rPr>
-        <w:t xml:space="preserve">1. ¿Cuál fue el tiempo total invertido en el laboratorio por cada uno de ustedes? (Horas) 2. ¿Cuál es el estado actual del laboratorio? ¿Por qué? </w:t>
-      </w:r>
-    </w:p>
-    <w:p>
-      <w:pPr>
-        <w:widowControl w:val="0"/>
+        <w:ind w:right="1183"/>
+        <w:rPr>
+          <w:color w:val="000000"/>
+          <w:sz w:val="21"/>
+          <w:szCs w:val="21"/>
+        </w:rPr>
+      </w:pPr>
+      <w:r>
+        <w:rPr>
+          <w:color w:val="000000"/>
+          <w:sz w:val="21"/>
+          <w:szCs w:val="21"/>
+        </w:rPr>
+        <w:t xml:space="preserve">¿Cuál fue el tiempo total invertido en el laboratorio por cada uno de ustedes? (Horas) </w:t>
+      </w:r>
+    </w:p>
+    <w:p>
+      <w:pPr>
+        <w:pStyle w:val="Prrafodelista"/>
+        <w:widowControl w:val="0"/>
+        <w:pBdr>
+          <w:top w:val="nil"/>
+          <w:left w:val="nil"/>
+          <w:bottom w:val="nil"/>
+          <w:right w:val="nil"/>
+          <w:between w:val="nil"/>
+        </w:pBdr>
+        <w:spacing w:before="64" w:line="211" w:lineRule="auto"/>
+        <w:ind w:left="631" w:right="1183"/>
+        <w:rPr>
+          <w:color w:val="000000"/>
+          <w:sz w:val="21"/>
+          <w:szCs w:val="21"/>
+        </w:rPr>
+      </w:pPr>
+      <w:r>
+        <w:rPr>
+          <w:color w:val="000000"/>
+          <w:sz w:val="21"/>
+          <w:szCs w:val="21"/>
+        </w:rPr>
+        <w:t>Juan Pablo Rodriguez: 8 horas</w:t>
+      </w:r>
+    </w:p>
+    <w:p>
+      <w:pPr>
+        <w:pStyle w:val="Prrafodelista"/>
+        <w:widowControl w:val="0"/>
+        <w:pBdr>
+          <w:top w:val="nil"/>
+          <w:left w:val="nil"/>
+          <w:bottom w:val="nil"/>
+          <w:right w:val="nil"/>
+          <w:between w:val="nil"/>
+        </w:pBdr>
+        <w:spacing w:before="64" w:line="211" w:lineRule="auto"/>
+        <w:ind w:left="631" w:right="1183"/>
+        <w:rPr>
+          <w:color w:val="000000"/>
+          <w:sz w:val="21"/>
+          <w:szCs w:val="21"/>
+        </w:rPr>
+      </w:pPr>
+      <w:r>
+        <w:rPr>
+          <w:color w:val="000000"/>
+          <w:sz w:val="21"/>
+          <w:szCs w:val="21"/>
+        </w:rPr>
+        <w:t>Jhojan Pulido: 8 horas</w:t>
+      </w:r>
+    </w:p>
+    <w:p>
+      <w:pPr>
+        <w:pStyle w:val="Prrafodelista"/>
+        <w:widowControl w:val="0"/>
+        <w:numPr>
+          <w:ilvl w:val="0"/>
+          <w:numId w:val="1"/>
+        </w:numPr>
+        <w:pBdr>
+          <w:top w:val="nil"/>
+          <w:left w:val="nil"/>
+          <w:bottom w:val="nil"/>
+          <w:right w:val="nil"/>
+          <w:between w:val="nil"/>
+        </w:pBdr>
+        <w:spacing w:before="64" w:line="211" w:lineRule="auto"/>
+        <w:ind w:right="1183"/>
+        <w:rPr>
+          <w:color w:val="000000"/>
+          <w:sz w:val="21"/>
+          <w:szCs w:val="21"/>
+        </w:rPr>
+      </w:pPr>
+      <w:r>
+        <w:rPr>
+          <w:color w:val="000000"/>
+          <w:sz w:val="21"/>
+          <w:szCs w:val="21"/>
+        </w:rPr>
+        <w:t xml:space="preserve">¿Cuál es el estado actual del laboratorio? ¿Por qué? </w:t>
+      </w:r>
+    </w:p>
+    <w:p>
+      <w:pPr>
+        <w:pStyle w:val="Prrafodelista"/>
+        <w:widowControl w:val="0"/>
+        <w:pBdr>
+          <w:top w:val="nil"/>
+          <w:left w:val="nil"/>
+          <w:bottom w:val="nil"/>
+          <w:right w:val="nil"/>
+          <w:between w:val="nil"/>
+        </w:pBdr>
+        <w:spacing w:before="64" w:line="211" w:lineRule="auto"/>
+        <w:ind w:left="631" w:right="1183"/>
+        <w:rPr>
+          <w:color w:val="000000"/>
+          <w:sz w:val="21"/>
+          <w:szCs w:val="21"/>
+        </w:rPr>
+      </w:pPr>
+      <w:r>
+        <w:rPr>
+          <w:color w:val="000000"/>
+          <w:sz w:val="21"/>
+          <w:szCs w:val="21"/>
+        </w:rPr>
+        <w:t xml:space="preserve">Casi completo ya que la creación de </w:t>
+      </w:r>
+      <w:proofErr w:type="spellStart"/>
+      <w:r>
+        <w:rPr>
+          <w:color w:val="000000"/>
+          <w:sz w:val="21"/>
+          <w:szCs w:val="21"/>
+        </w:rPr>
+        <w:t>triggers</w:t>
+      </w:r>
+      <w:proofErr w:type="spellEnd"/>
+      <w:r>
+        <w:rPr>
+          <w:color w:val="000000"/>
+          <w:sz w:val="21"/>
+          <w:szCs w:val="21"/>
+        </w:rPr>
+        <w:t xml:space="preserve"> fue algo compleja</w:t>
+      </w:r>
+    </w:p>
+    <w:p>
+      <w:pPr>
+        <w:pStyle w:val="Prrafodelista"/>
+        <w:widowControl w:val="0"/>
+        <w:numPr>
+          <w:ilvl w:val="0"/>
+          <w:numId w:val="1"/>
+        </w:numPr>
         <w:pBdr>
           <w:top w:val="nil"/>
           <w:left w:val="nil"/>
@@ -2421,24 +2625,25 @@
           <w:between w:val="nil"/>
         </w:pBdr>
         <w:spacing w:before="2" w:line="211" w:lineRule="auto"/>
-        <w:ind w:left="256" w:right="1772"/>
-        <w:rPr>
-          <w:color w:val="000000"/>
-          <w:sz w:val="21"/>
-          <w:szCs w:val="21"/>
-        </w:rPr>
-      </w:pPr>
-      <w:r>
-        <w:rPr>
-          <w:color w:val="000000"/>
-          <w:sz w:val="21"/>
-          <w:szCs w:val="21"/>
-        </w:rPr>
-        <w:t xml:space="preserve">3. Considerando las prácticas XP del laboratorio, ¿cuál fue la más útil? ¿por qué? 4. ¿Cuál consideran fue el mayor logro? ¿Por qué? </w:t>
-      </w:r>
-    </w:p>
-    <w:p>
-      <w:pPr>
+        <w:ind w:right="1772"/>
+        <w:rPr>
+          <w:color w:val="000000"/>
+          <w:sz w:val="21"/>
+          <w:szCs w:val="21"/>
+        </w:rPr>
+      </w:pPr>
+      <w:r>
+        <w:rPr>
+          <w:color w:val="000000"/>
+          <w:sz w:val="21"/>
+          <w:szCs w:val="21"/>
+        </w:rPr>
+        <w:t xml:space="preserve">Considerando las prácticas XP del laboratorio, ¿cuál fue la más útil? ¿por qué? </w:t>
+      </w:r>
+    </w:p>
+    <w:p>
+      <w:pPr>
+        <w:pStyle w:val="Prrafodelista"/>
         <w:widowControl w:val="0"/>
         <w:pBdr>
           <w:top w:val="nil"/>
@@ -2448,20 +2653,270 @@
           <w:between w:val="nil"/>
         </w:pBdr>
         <w:spacing w:before="2" w:line="211" w:lineRule="auto"/>
-        <w:ind w:left="259" w:right="251" w:hanging="1"/>
-        <w:rPr>
-          <w:color w:val="000000"/>
-          <w:sz w:val="21"/>
-          <w:szCs w:val="21"/>
-        </w:rPr>
-      </w:pPr>
-      <w:r>
-        <w:rPr>
-          <w:color w:val="000000"/>
-          <w:sz w:val="21"/>
-          <w:szCs w:val="21"/>
-        </w:rPr>
-        <w:t xml:space="preserve">5. ¿Cuál consideran que fue el mayor problema técnico? ¿Qué hicieron para resolverlo? 6. ¿Qué hicieron bien como equipo? ¿Qué se comprometen a hacer para mejorar los resultados? 7. ¿Qué referencias usaron? ¿Cuál fue la más útil? Incluyan citas con estándares adecuados. </w:t>
+        <w:ind w:left="631" w:right="1772"/>
+        <w:rPr>
+          <w:color w:val="000000"/>
+          <w:sz w:val="21"/>
+          <w:szCs w:val="21"/>
+        </w:rPr>
+      </w:pPr>
+      <w:r>
+        <w:rPr>
+          <w:color w:val="000000"/>
+          <w:sz w:val="21"/>
+          <w:szCs w:val="21"/>
+        </w:rPr>
+        <w:t xml:space="preserve">La parte de construcción ya que ayuda a poder estar al tanto de la sintaxis y ayuda a pensar en </w:t>
+      </w:r>
+      <w:proofErr w:type="spellStart"/>
+      <w:r>
+        <w:rPr>
+          <w:color w:val="000000"/>
+          <w:sz w:val="21"/>
+          <w:szCs w:val="21"/>
+        </w:rPr>
+        <w:t>como</w:t>
+      </w:r>
+      <w:proofErr w:type="spellEnd"/>
+      <w:r>
+        <w:rPr>
+          <w:color w:val="000000"/>
+          <w:sz w:val="21"/>
+          <w:szCs w:val="21"/>
+        </w:rPr>
+        <w:t xml:space="preserve"> usar la base de datos</w:t>
+      </w:r>
+    </w:p>
+    <w:p>
+      <w:pPr>
+        <w:pStyle w:val="Prrafodelista"/>
+        <w:widowControl w:val="0"/>
+        <w:numPr>
+          <w:ilvl w:val="0"/>
+          <w:numId w:val="1"/>
+        </w:numPr>
+        <w:pBdr>
+          <w:top w:val="nil"/>
+          <w:left w:val="nil"/>
+          <w:bottom w:val="nil"/>
+          <w:right w:val="nil"/>
+          <w:between w:val="nil"/>
+        </w:pBdr>
+        <w:spacing w:before="2" w:line="211" w:lineRule="auto"/>
+        <w:ind w:right="1772"/>
+        <w:rPr>
+          <w:color w:val="000000"/>
+          <w:sz w:val="21"/>
+          <w:szCs w:val="21"/>
+        </w:rPr>
+      </w:pPr>
+      <w:r>
+        <w:rPr>
+          <w:color w:val="000000"/>
+          <w:sz w:val="21"/>
+          <w:szCs w:val="21"/>
+        </w:rPr>
+        <w:t>¿Cuál consideran fue el mayor logro? ¿Por qué?</w:t>
+      </w:r>
+    </w:p>
+    <w:p>
+      <w:pPr>
+        <w:pStyle w:val="Prrafodelista"/>
+        <w:widowControl w:val="0"/>
+        <w:pBdr>
+          <w:top w:val="nil"/>
+          <w:left w:val="nil"/>
+          <w:bottom w:val="nil"/>
+          <w:right w:val="nil"/>
+          <w:between w:val="nil"/>
+        </w:pBdr>
+        <w:spacing w:before="2" w:line="211" w:lineRule="auto"/>
+        <w:ind w:left="631" w:right="1772"/>
+        <w:rPr>
+          <w:color w:val="000000"/>
+          <w:sz w:val="21"/>
+          <w:szCs w:val="21"/>
+        </w:rPr>
+      </w:pPr>
+      <w:r>
+        <w:rPr>
+          <w:color w:val="000000"/>
+          <w:sz w:val="21"/>
+          <w:szCs w:val="21"/>
+        </w:rPr>
+        <w:t xml:space="preserve">Crear el </w:t>
+      </w:r>
+      <w:proofErr w:type="spellStart"/>
+      <w:r>
+        <w:rPr>
+          <w:color w:val="000000"/>
+          <w:sz w:val="21"/>
+          <w:szCs w:val="21"/>
+        </w:rPr>
+        <w:t>trigger</w:t>
+      </w:r>
+      <w:proofErr w:type="spellEnd"/>
+      <w:r>
+        <w:rPr>
+          <w:color w:val="000000"/>
+          <w:sz w:val="21"/>
+          <w:szCs w:val="21"/>
+        </w:rPr>
+        <w:t xml:space="preserve"> ya que fue demasiado </w:t>
+      </w:r>
+      <w:proofErr w:type="spellStart"/>
+      <w:r>
+        <w:rPr>
+          <w:color w:val="000000"/>
+          <w:sz w:val="21"/>
+          <w:szCs w:val="21"/>
+        </w:rPr>
+        <w:t>dificil</w:t>
+      </w:r>
+      <w:proofErr w:type="spellEnd"/>
+      <w:r>
+        <w:rPr>
+          <w:color w:val="000000"/>
+          <w:sz w:val="21"/>
+          <w:szCs w:val="21"/>
+        </w:rPr>
+        <w:t xml:space="preserve"> </w:t>
+      </w:r>
+    </w:p>
+    <w:p>
+      <w:pPr>
+        <w:pStyle w:val="Prrafodelista"/>
+        <w:widowControl w:val="0"/>
+        <w:numPr>
+          <w:ilvl w:val="0"/>
+          <w:numId w:val="1"/>
+        </w:numPr>
+        <w:pBdr>
+          <w:top w:val="nil"/>
+          <w:left w:val="nil"/>
+          <w:bottom w:val="nil"/>
+          <w:right w:val="nil"/>
+          <w:between w:val="nil"/>
+        </w:pBdr>
+        <w:spacing w:before="2" w:line="211" w:lineRule="auto"/>
+        <w:ind w:right="251"/>
+        <w:rPr>
+          <w:color w:val="000000"/>
+          <w:sz w:val="21"/>
+          <w:szCs w:val="21"/>
+        </w:rPr>
+      </w:pPr>
+      <w:r>
+        <w:rPr>
+          <w:color w:val="000000"/>
+          <w:sz w:val="21"/>
+          <w:szCs w:val="21"/>
+        </w:rPr>
+        <w:t xml:space="preserve">¿Cuál consideran que fue el mayor problema técnico? ¿Qué hicieron para resolverlo? </w:t>
+      </w:r>
+    </w:p>
+    <w:p>
+      <w:pPr>
+        <w:pStyle w:val="Prrafodelista"/>
+        <w:widowControl w:val="0"/>
+        <w:numPr>
+          <w:ilvl w:val="0"/>
+          <w:numId w:val="1"/>
+        </w:numPr>
+        <w:pBdr>
+          <w:top w:val="nil"/>
+          <w:left w:val="nil"/>
+          <w:bottom w:val="nil"/>
+          <w:right w:val="nil"/>
+          <w:between w:val="nil"/>
+        </w:pBdr>
+        <w:spacing w:before="2" w:line="211" w:lineRule="auto"/>
+        <w:ind w:right="251"/>
+        <w:rPr>
+          <w:color w:val="000000"/>
+          <w:sz w:val="21"/>
+          <w:szCs w:val="21"/>
+        </w:rPr>
+      </w:pPr>
+      <w:r>
+        <w:rPr>
+          <w:color w:val="000000"/>
+          <w:sz w:val="21"/>
+          <w:szCs w:val="21"/>
+        </w:rPr>
+        <w:t xml:space="preserve">¿Qué hicieron bien como equipo? ¿Qué se comprometen a hacer para mejorar los resultados? </w:t>
+      </w:r>
+    </w:p>
+    <w:p>
+      <w:pPr>
+        <w:pStyle w:val="Prrafodelista"/>
+        <w:widowControl w:val="0"/>
+        <w:pBdr>
+          <w:top w:val="nil"/>
+          <w:left w:val="nil"/>
+          <w:bottom w:val="nil"/>
+          <w:right w:val="nil"/>
+          <w:between w:val="nil"/>
+        </w:pBdr>
+        <w:spacing w:before="2" w:line="211" w:lineRule="auto"/>
+        <w:ind w:left="631" w:right="251"/>
+        <w:rPr>
+          <w:color w:val="000000"/>
+          <w:sz w:val="21"/>
+          <w:szCs w:val="21"/>
+        </w:rPr>
+      </w:pPr>
+      <w:r>
+        <w:rPr>
+          <w:color w:val="000000"/>
+          <w:sz w:val="21"/>
+          <w:szCs w:val="21"/>
+        </w:rPr>
+        <w:t>Como equipo estuvo bien el trabajo conjunto y nos comprometemos a sacar mejores resultados en la base de datos</w:t>
+      </w:r>
+      <w:r>
+        <w:rPr>
+          <w:color w:val="000000"/>
+          <w:sz w:val="21"/>
+          <w:szCs w:val="21"/>
+        </w:rPr>
+        <w:br/>
+      </w:r>
+      <w:r>
+        <w:rPr>
+          <w:color w:val="000000"/>
+          <w:sz w:val="21"/>
+          <w:szCs w:val="21"/>
+        </w:rPr>
+        <w:t xml:space="preserve">7. ¿Qué referencias usaron? ¿Cuál fue la más útil? Incluyan citas con estándares adecuados. </w:t>
+      </w:r>
+    </w:p>
+    <w:p>
+      <w:pPr>
+        <w:pStyle w:val="Prrafodelista"/>
+        <w:widowControl w:val="0"/>
+        <w:pBdr>
+          <w:top w:val="nil"/>
+          <w:left w:val="nil"/>
+          <w:bottom w:val="nil"/>
+          <w:right w:val="nil"/>
+          <w:between w:val="nil"/>
+        </w:pBdr>
+        <w:spacing w:before="2" w:line="211" w:lineRule="auto"/>
+        <w:ind w:left="631" w:right="251"/>
+        <w:rPr>
+          <w:color w:val="000000"/>
+          <w:sz w:val="21"/>
+          <w:szCs w:val="21"/>
+        </w:rPr>
+      </w:pPr>
+      <w:r>
+        <w:rPr>
+          <w:color w:val="000000"/>
+          <w:sz w:val="21"/>
+          <w:szCs w:val="21"/>
+        </w:rPr>
+        <w:t>El laboratorio pasado ya que había grandes avances ahi</w:t>
       </w:r>
     </w:p>
     <w:p>
@@ -2501,6 +2956,103 @@
     </w:sectPr>
   </w:body>
 </w:document>
+</file>
+
+<file path=word/numbering.xml><?xml version="1.0" encoding="utf-8"?>
+<w:numbering xmlns:wpc="http://schemas.microsoft.com/office/word/2010/wordprocessingCanvas" xmlns:cx="http://schemas.microsoft.com/office/drawing/2014/chartex" xmlns:cx1="http://schemas.microsoft.com/office/drawing/2015/9/8/chartex" xmlns:cx2="http://schemas.microsoft.com/office/drawing/2015/10/21/chartex" xmlns:cx3="http://schemas.microsoft.com/office/drawing/2016/5/9/chartex" xmlns:cx4="http://schemas.microsoft.com/office/drawing/2016/5/10/chartex" xmlns:cx5="http://schemas.microsoft.com/office/drawing/2016/5/11/chartex" xmlns:cx6="http://schemas.microsoft.com/office/drawing/2016/5/12/chartex" xmlns:cx7="http://schemas.microsoft.com/office/drawing/2016/5/13/chartex" xmlns:cx8="http://schemas.microsoft.com/office/drawing/2016/5/14/chartex" xmlns:mc="http://schemas.openxmlformats.org/markup-compatibility/2006" xmlns:aink="http://schemas.microsoft.com/office/drawing/2016/ink" xmlns:am3d="http://schemas.microsoft.com/office/drawing/2017/model3d" xmlns:o="urn:schemas-microsoft-com:office:office" xmlns:oel="http://schemas.microsoft.com/office/2019/extlst" xmlns:r="http://schemas.openxmlformats.org/officeDocument/2006/relationships" xmlns:m="http://schemas.openxmlformats.org/officeDocument/2006/math" xmlns:v="urn:schemas-microsoft-com:vml" xmlns:wp14="http://schemas.microsoft.com/office/word/2010/wordprocessingDrawing" xmlns:wp="http://schemas.openxmlformats.org/drawingml/2006/wordprocessingDrawing" xmlns:w10="urn:schemas-microsoft-com:office:word" xmlns:w="http://schemas.openxmlformats.org/wordprocessingml/2006/main" xmlns:w14="http://schemas.microsoft.com/office/word/2010/wordml" xmlns:w15="http://schemas.microsoft.com/office/word/2012/wordml" xmlns:w16cex="http://schemas.microsoft.com/office/word/2018/wordml/cex" xmlns:w16cid="http://schemas.microsoft.com/office/word/2016/wordml/cid" xmlns:w16="http://schemas.microsoft.com/office/word/2018/wordml" xmlns:w16du="http://schemas.microsoft.com/office/word/2023/wordml/word16du" xmlns:w16sdtdh="http://schemas.microsoft.com/office/word/2020/wordml/sdtdatahash" xmlns:w16sdtfl="http://schemas.microsoft.com/office/word/2024/wordml/sdtformatlock" xmlns:w16se="http://schemas.microsoft.com/office/word/2015/wordml/symex" xmlns:wpg="http://schemas.microsoft.com/office/word/2010/wordprocessingGroup" xmlns:wpi="http://schemas.microsoft.com/office/word/2010/wordprocessingInk" xmlns:wne="http://schemas.microsoft.com/office/word/2006/wordml" xmlns:wps="http://schemas.microsoft.com/office/word/2010/wordprocessingShape" mc:Ignorable="w14 w15 w16se w16cid w16 w16cex w16sdtdh w16sdtfl w16du wp14">
+  <w:abstractNum w:abstractNumId="0" w15:restartNumberingAfterBreak="0">
+    <w:nsid w:val="5AEB3524"/>
+    <w:multiLevelType w:val="hybridMultilevel"/>
+    <w:tmpl w:val="C250F3B2"/>
+    <w:lvl w:ilvl="0" w:tplc="25129522">
+      <w:start w:val="1"/>
+      <w:numFmt w:val="decimal"/>
+      <w:lvlText w:val="%1."/>
+      <w:lvlJc w:val="left"/>
+      <w:pPr>
+        <w:ind w:left="631" w:hanging="360"/>
+      </w:pPr>
+      <w:rPr>
+        <w:rFonts w:hint="default"/>
+      </w:rPr>
+    </w:lvl>
+    <w:lvl w:ilvl="1" w:tplc="080A0019" w:tentative="1">
+      <w:start w:val="1"/>
+      <w:numFmt w:val="lowerLetter"/>
+      <w:lvlText w:val="%2."/>
+      <w:lvlJc w:val="left"/>
+      <w:pPr>
+        <w:ind w:left="1351" w:hanging="360"/>
+      </w:pPr>
+    </w:lvl>
+    <w:lvl w:ilvl="2" w:tplc="080A001B" w:tentative="1">
+      <w:start w:val="1"/>
+      <w:numFmt w:val="lowerRoman"/>
+      <w:lvlText w:val="%3."/>
+      <w:lvlJc w:val="right"/>
+      <w:pPr>
+        <w:ind w:left="2071" w:hanging="180"/>
+      </w:pPr>
+    </w:lvl>
+    <w:lvl w:ilvl="3" w:tplc="080A000F" w:tentative="1">
+      <w:start w:val="1"/>
+      <w:numFmt w:val="decimal"/>
+      <w:lvlText w:val="%4."/>
+      <w:lvlJc w:val="left"/>
+      <w:pPr>
+        <w:ind w:left="2791" w:hanging="360"/>
+      </w:pPr>
+    </w:lvl>
+    <w:lvl w:ilvl="4" w:tplc="080A0019" w:tentative="1">
+      <w:start w:val="1"/>
+      <w:numFmt w:val="lowerLetter"/>
+      <w:lvlText w:val="%5."/>
+      <w:lvlJc w:val="left"/>
+      <w:pPr>
+        <w:ind w:left="3511" w:hanging="360"/>
+      </w:pPr>
+    </w:lvl>
+    <w:lvl w:ilvl="5" w:tplc="080A001B" w:tentative="1">
+      <w:start w:val="1"/>
+      <w:numFmt w:val="lowerRoman"/>
+      <w:lvlText w:val="%6."/>
+      <w:lvlJc w:val="right"/>
+      <w:pPr>
+        <w:ind w:left="4231" w:hanging="180"/>
+      </w:pPr>
+    </w:lvl>
+    <w:lvl w:ilvl="6" w:tplc="080A000F" w:tentative="1">
+      <w:start w:val="1"/>
+      <w:numFmt w:val="decimal"/>
+      <w:lvlText w:val="%7."/>
+      <w:lvlJc w:val="left"/>
+      <w:pPr>
+        <w:ind w:left="4951" w:hanging="360"/>
+      </w:pPr>
+    </w:lvl>
+    <w:lvl w:ilvl="7" w:tplc="080A0019" w:tentative="1">
+      <w:start w:val="1"/>
+      <w:numFmt w:val="lowerLetter"/>
+      <w:lvlText w:val="%8."/>
+      <w:lvlJc w:val="left"/>
+      <w:pPr>
+        <w:ind w:left="5671" w:hanging="360"/>
+      </w:pPr>
+    </w:lvl>
+    <w:lvl w:ilvl="8" w:tplc="080A001B" w:tentative="1">
+      <w:start w:val="1"/>
+      <w:numFmt w:val="lowerRoman"/>
+      <w:lvlText w:val="%9."/>
+      <w:lvlJc w:val="right"/>
+      <w:pPr>
+        <w:ind w:left="6391" w:hanging="180"/>
+      </w:pPr>
+    </w:lvl>
+  </w:abstractNum>
+  <w:num w:numId="1" w16cid:durableId="1933707758">
+    <w:abstractNumId w:val="0"/>
+  </w:num>
+</w:numbering>
 </file>
 
 <file path=word/styles.xml><?xml version="1.0" encoding="utf-8"?>
@@ -3100,6 +3652,17 @@
       <w:szCs w:val="48"/>
     </w:rPr>
   </w:style>
+  <w:style w:type="paragraph" w:styleId="Prrafodelista">
+    <w:name w:val="List Paragraph"/>
+    <w:basedOn w:val="Normal"/>
+    <w:uiPriority w:val="34"/>
+    <w:qFormat/>
+    <w:rsid w:val="003F12C5"/>
+    <w:pPr>
+      <w:ind w:left="720"/>
+      <w:contextualSpacing/>
+    </w:pPr>
+  </w:style>
 </w:styles>
 </file>
 

</xml_diff>